<commit_message>
Merge the Methods into Site terrain, Beetle outbreak and Model design, fold the literature review into the Introduction, and update the author response
</commit_message>
<xml_diff>
--- a/01.manuscript/Author Response.docx
+++ b/01.manuscript/Author Response.docx
@@ -76,7 +76,7 @@
         <w:t xml:space="preserve"> </w:t>
       </w:r>
       <w:r>
-        <w:t xml:space="preserve">The literature was assembled under a written protocol, frozen before the first search, with one review question for each of the study’s three questions and a fourth on whether the design had a precedent. Two indexes and my reading store were searched on 23 September 2026, and one round of citation chasing followed. The searches returned 1,636 records, 1,257 after duplicates were removed, of which 198 were retained and 35 were read in full. The protocol and counts are reported in section 2.1. The reference list grew from 30 works to 71.</w:t>
+        <w:t xml:space="preserve">The literature was assembled under a written protocol, frozen before the first search, with one review question for each of the study’s three questions and a fourth on whether the design had a precedent. Two indexes and my reading store were searched on 23 September 2026, and one round of citation chasing followed. The searches returned 1,636 records, 1,257 after duplicates were removed, of which 198 were retained and 35 were read in full. The protocol and counts are reported at the end of the Introduction. The reference list grew from 30 works to 84.</w:t>
       </w:r>
     </w:p>
     <w:p>
@@ -84,7 +84,7 @@
         <w:pStyle w:val="BodyText"/>
       </w:pPr>
       <w:r>
-        <w:t xml:space="preserve">The Introduction (section 1) was rewritten on that literature in five paragraphs. The first sets the study inside the landscape modelling of the outbreak, from Aukema et al. (2006, 2008), Robertson et al. (2007), Chen and Walton (2011), Chapman et al. (2012), Preisler et al. (2012), Simard et al. (2011) and Walter and Platt (2013). The second grounds the density and wind mechanism in the thinning trials and stand measurements that established it, Mitchell et al. (1983), Waring and Pitman (1985), Amman et al. (1988), Bartos and Amman (1989), Schmid et al. (1992), Preisler and Mitchell (1993) and Thistle et al. (2004), and states the within-stand evidence against it. The third sets out the landing and deposition literature, Hynum and Berryman (1980), Byers (2000), de la Giroday et al. (2011) and Plattner et al. (2004). The fourth places the study against its companion study (Murphy et al., 2026) and against the models that entered wind, and the fifth states the three questions. The Discussion was rewritten from the start, as described under the Associate Editor’s comments.</w:t>
+        <w:t xml:space="preserve">The Introduction (section 1) was rewritten on that literature in five paragraphs. The first sets the study inside the host defences, climate and landscape modelling of the outbreak, from Raffa and Berryman (1983), Logan and Powell (2001), Kurz et al. (2008), Aukema et al. (2006, 2008), Robertson et al. (2007), Chen and Walton (2011), de la Giroday et al. (2012), Chapman et al. (2012), Preisler et al. (2012), Simard et al. (2011) and Walter and Platt (2013), and sets dispersal within and above the canopy against the wind from Safranyik et al. (1989, 1992) and Chen and Jackson (2017). The second grounds the density and wind mechanism in the thinning trials and stand measurements that established it, Mitchell et al. (1983), Waring and Pitman (1985), Amman et al. (1988), Bartos and Amman (1989), Schmid et al. (1992), Preisler and Mitchell (1993) and Thistle et al. (2004), and states the within-stand evidence against it. The third sets out the landing and deposition literature, Hynum and Berryman (1980), Byers (2000), de la Giroday et al. (2011) and Plattner et al. (2004). The fourth places the study against its companion study (Murphy et al., 2026) and against the models that entered wind, and the fifth states the three questions. The Discussion was rewritten from the start, as described under the Associate Editor’s comments.</w:t>
       </w:r>
     </w:p>
     <w:p>
@@ -120,7 +120,7 @@
         <w:t xml:space="preserve"> </w:t>
       </w:r>
       <w:r>
-        <w:t xml:space="preserve">The novelty is stated as what the study did rather than as a claim about what no one else has done. The last paragraph of the Introduction (section 1) states that the landscape models of the outbreak entered terrain as elevation, slope and aspect and weather as temperature and precipitation, that one machine-learning model of the Alberta outbreak entered a seasonal mean station wind (Ramazi et al., 2021), and that the transport models of flight above the canopy resolved wind over terrain without the stand beneath it (Jackson et al., 2008; Ainslie and Jackson, 2010). It then states that this study entered a terrain-resolved wind field at the sixteen-day interval of the response together with stand density, so that the terrain main effect deposition predicts could be told apart from the density by wind interaction plume disruption predicts. The first statement of the abstract names the gap as how little is known about the three mechanisms acting together at the interval over which attack and wind vary. The revision added a second element of novelty, which is that the three refugia mechanisms of Krawchuk et al. (2020) were tested beside explicit terms for attack nearby and earlier, built in the order of Aukema et al. (2008), and then checked under a latent spatial field and at four grains (sections 2.8, 3.3, 3.7 and 3.8).</w:t>
+        <w:t xml:space="preserve">The novelty is stated as what the study did rather than as a claim about what no one else has done. The last paragraph of the Introduction (section 1) states that the landscape models of the outbreak entered terrain as elevation, slope and aspect and weather as temperature and precipitation, that one machine-learning model of the Alberta outbreak entered a seasonal mean station wind (Ramazi et al., 2021), and that the transport models of flight above the canopy resolved wind over terrain without the stand beneath it (Jackson et al., 2008; Ainslie and Jackson, 2010). It then states that this study entered a terrain-resolved wind field at the sixteen-day interval of the response together with stand density, so that the terrain main effect deposition predicts could be told apart from the density by wind interaction plume disruption predicts. The first statement of the abstract names the gap as how little is known about the three mechanisms acting together at the interval over which attack and wind vary. The revision added a second element of novelty, which is that the three refugia mechanisms of Krawchuk et al. (2020) were tested beside explicit terms for attack nearby and earlier, built in the order of Aukema et al. (2008), and then checked under a latent spatial field and at four grains (sections 2.3, 3.3, 3.7 and 3.8).</w:t>
       </w:r>
     </w:p>
     <w:bookmarkEnd w:id="20"/>
@@ -202,7 +202,7 @@
         <w:t xml:space="preserve"> </w:t>
       </w:r>
       <w:r>
-        <w:t xml:space="preserve">The Discussion (section 4) was rewritten in six sections, each of which sets a result against prior work on this beetle, and coefficients are repeated only where the argument needs them. Section 4.1 reads the dominance of nearby and earlier attack as the landscape trace of dispersal under the canopy (Robertson et al., 2007; Chen and Walton, 2011; Safranyik et al., 1992), against the provincial scale of Aukema et al. (2008). Section 4.2 reads the host result against the susceptibility rating of Shore et al. (2000), the thinning trials and the source-sink threshold of Carroll and Safranyik (2004). Section 4.3 reads the wind interaction against the stand measurements of Bartos and Amman (1989) and Thistle et al. (2004), and explains why a sixteen-day wind field could not show more, citing the timing of crown fade given by Safranyik and Carroll (2006, p. 11). Section 4.4 reads the openness result as deposition (Byers, 2000; de la Giroday et al., 2011) and the aspect result against Kaiser et al. (2012) and Nelson et al. (2007). Section 4.5 takes up the scale of inference Aukema et al. (2008) raised, and section 4.6 the limits and management.</w:t>
+        <w:t xml:space="preserve">The Discussion (section 4) was rewritten in six sections, each of which sets a result against prior work on this beetle, and coefficients are repeated only where the argument needs them. Section 4.1 reads the dominance of nearby and earlier attack as the landscape trace of dispersal under the canopy (Robertson et al., 2007; Chen and Walton, 2011; Safranyik et al., 1992), against the provincial scale of Aukema et al. (2008). Section 4.2 reads the host result against the susceptibility rating of Shore et al. (2000), the thinning trials, the source-sink threshold of Carroll and Safranyik (2004), the dependence of brood production on phloem thickness (Amman, 1972) and the colonisation patterns of Mitchell and Preisler (1991). Section 4.3 reads the wind interaction against the stand measurements of Bartos and Amman (1989) and Thistle et al. (2004) and against Safranyik et al. (1989), who found wind speed had a negligible effect on the direction beetles dispersed, and explains why a sixteen-day wind field could not show more, citing the timing of crown fade given by Safranyik and Carroll (2006, p. 11). Section 4.4 reads the openness result as deposition (Byers, 2000; de la Giroday et al., 2011) and the aspect result against Kaiser et al. (2012) and Nelson et al. (2007). Section 4.5 takes up the scale of inference Aukema et al. (2008) raised, and section 4.6 the limits and management.</w:t>
       </w:r>
     </w:p>
     <w:p>
@@ -268,7 +268,7 @@
         </w:numPr>
       </w:pPr>
       <w:r>
-        <w:t xml:space="preserve">The response is now red-stage attack in each of 47 sixteen-day Landsat periods over eight outbreak years, and every stage of the analysis runs on those periods (section 2.3).</w:t>
+        <w:t xml:space="preserve">The response is now red-stage attack in each of 47 sixteen-day Landsat periods over eight outbreak years, and every stage of the analysis runs on those periods (section 2.2).</w:t>
       </w:r>
     </w:p>
     <w:p>
@@ -292,7 +292,7 @@
         </w:numPr>
       </w:pPr>
       <w:r>
-        <w:t xml:space="preserve">The terrain-resolved wind field was recomputed on an elevation model extending beyond the study area. In the submitted analysis its curvature term reached past the edge of an elevation model cut to the study area, so the field covered 18,388 of the 61,923 cells, and it now covers all of them (section 2.4).</w:t>
+        <w:t xml:space="preserve">The terrain-resolved wind field was recomputed on an elevation model extending beyond the study area. In the submitted analysis its curvature term reached past the edge of an elevation model cut to the study area, so the field covered 18,388 of the 61,923 cells, and it now covers all of them (section 2.2).</w:t>
       </w:r>
     </w:p>
     <w:p>
@@ -304,7 +304,7 @@
         </w:numPr>
       </w:pPr>
       <w:r>
-        <w:t xml:space="preserve">Spatial pattern is now described before any model is fitted, with the point pattern methods of the companion study, and attack was clustered in 45 of 47 periods (sections 2.7 and 3.2). Two distances were estimated at that stage and both entered the models. The kernel bandwidth of each period was chosen by likelihood cross-validation, a median of 67 m, and the neighbourhood terms were computed as shares weighted by a Gaussian kernel at that bandwidth and compared on AIC with shares within six fixed radii, which they matched or bettered (section 3.3, Table 3). The clustering range of the L function, a median of 750 m, set the range of the latent spatial field (section 2.8).</w:t>
+        <w:t xml:space="preserve">Spatial pattern is now described before any model is fitted, with the point pattern methods of the companion study, and attack was clustered in 45 of 47 periods (sections 2.3 and 3.2). Two distances were estimated at that stage and both entered the models. The kernel bandwidth of each period was chosen by likelihood cross-validation, a median of 67 m, and the neighbourhood terms were computed as shares weighted by a Gaussian kernel at that bandwidth and compared on AIC with shares within six fixed radii, which they matched or bettered (section 3.3, Table 3). The clustering range of the L function, a median of 750 m, set the range of the latent spatial field (section 2.3).</w:t>
       </w:r>
     </w:p>
     <w:p>
@@ -316,7 +316,7 @@
         </w:numPr>
       </w:pPr>
       <w:r>
-        <w:t xml:space="preserve">The models were rebuilt in the order of Aukema et al. (2008), dependence terms first, then each environmental variable alone, then backward elimination, and the final model was refitted with a latent spatial field and at four grains (sections 2.8 and 3.3 to 3.8).</w:t>
+        <w:t xml:space="preserve">The models were rebuilt in the order of Aukema et al. (2008), dependence terms first, then each environmental variable alone, then backward elimination, and the final model was refitted with a latent spatial field and at four grains (sections 2.3 and 3.3 to 3.8).</w:t>
       </w:r>
     </w:p>
     <w:p>

</xml_diff>

<commit_message>
Add the wind, lift, radiation, microclimate, trajectory and fusion work of 3 to 9 October, the 2012 Landsat 7 map and the rendered manuscript, and ignore the rebuildable WindNinja and mixed-layer bulk outputs
</commit_message>
<xml_diff>
--- a/01.manuscript/Author Response.docx
+++ b/01.manuscript/Author Response.docx
@@ -76,7 +76,7 @@
         <w:t xml:space="preserve"> </w:t>
       </w:r>
       <w:r>
-        <w:t xml:space="preserve">The literature was gathered in two searches under written protocols, on 23 and 24 September 2026, which screened 1,257 and 4,430 unique records, and the reference list grew from 30 to 84 works. The Introduction (section 1) was rewritten on that literature. It opens with the beetle as a native disturbance agent of pine forests and the history of its outbreaks</w:t>
+        <w:t xml:space="preserve">The literature was gathered in two searches under written protocols, on 23 and 24 September 2026, which screened 1,257 and 4,430 unique records, and the reference list grew from 30 to 99 works. The Introduction (section 1) was rewritten on that literature. It opens with the beetle as a native disturbance agent of pine forests and the history of its outbreaks</w:t>
       </w:r>
       <w:r>
         <w:t xml:space="preserve"> </w:t>
@@ -678,34 +678,7 @@
       </w:r>
     </w:p>
     <w:bookmarkEnd w:id="21"/>
-    <w:bookmarkStart w:id="22" w:name="reporting-correction"/>
-    <w:p>
-      <w:pPr>
-        <w:pStyle w:val="Heading1"/>
-      </w:pPr>
-      <w:r>
-        <w:t xml:space="preserve">Reporting correction</w:t>
-      </w:r>
-    </w:p>
-    <w:p>
-      <w:pPr>
-        <w:pStyle w:val="FirstParagraph"/>
-      </w:pPr>
-      <w:r>
-        <w:t xml:space="preserve">The submitted manuscript misread the sign of its main wind result, and the correction is set out here in full so that the change in the conclusion on plume disruption is understood before the revised Results are read. The submitted Results reported the interaction of live stems with flight-period wind, -0.049, as attack falling</w:t>
-      </w:r>
-      <w:r>
-        <w:t xml:space="preserve"> </w:t>
-      </w:r>
-      <w:r>
-        <w:t xml:space="preserve">“where a thin stand and strong flight-period wind coincided”</w:t>
-      </w:r>
-      <w:r>
-        <w:t xml:space="preserve">, and the abstract concluded that wind disruption was supported conditionally. With standardised terms a negative interaction means that the effect of wind weakens as stems increase. In the submitted model the main effect of wind was +0.022, so the slope of attack on wind was about +0.071 one standard deviation below the mean stem density and -0.027 one standard deviation above it. Wind therefore raised attack in thin stands and not in dense ones, the reverse of what plume disruption predicts, and the submitted conclusion did not follow from the submitted coefficients. The error was in the reading of the coefficient and not in the model. The revised manuscript reads every interaction as the slope of one term at one standard deviation either side of the mean of the other, states those slopes in the Results (sections 3.1 to 3.3), and concludes that flight-hour wind did not lower attack in thin stands.</w:t>
-      </w:r>
-    </w:p>
-    <w:bookmarkEnd w:id="22"/>
-    <w:bookmarkStart w:id="23" w:name="analysis-repairs"/>
+    <w:bookmarkStart w:id="22" w:name="analysis-repairs"/>
     <w:p>
       <w:pPr>
         <w:pStyle w:val="Heading1"/>
@@ -766,58 +739,50 @@
       <w:r>
         <w:t xml:space="preserve">The terrain-adjusted wind field was recomputed on an elevation model extending beyond the study area. In the submitted analysis its curvature term was computed on an elevation model cut to the study area, so the field covered 18,388 of the 61,923 cells, and every wind term rested on that partial field. It now covers all of them (section 2.2).</w:t>
       </w:r>
-      <w:r>
-        <w:t xml:space="preserve"> </w:t>
-      </w:r>
-      <w:r>
-        <w:t xml:space="preserve">The spatial statistics were added beside the submitted models. Join counts and a Moran’s I correlogram described the pattern of attack on each annual map before any model was fitted. The models were then built in the order of</w:t>
-      </w:r>
-      <w:r>
-        <w:t xml:space="preserve"> </w:t>
-      </w:r>
-      <w:r>
-        <w:t xml:space="preserve">Aukema et al. (2008)</w:t>
-      </w:r>
-      <w:r>
-        <w:t xml:space="preserve">, with the terms for attack in and around each cell the year before chosen first, and the final annual model was refitted with a latent spatial field and at grains of 90, 270 and 990 m (section 2.3).</w:t>
-      </w:r>
-    </w:p>
-    <w:bookmarkEnd w:id="23"/>
-    <w:bookmarkStart w:id="25" w:name="findings"/>
-    <w:p>
-      <w:pPr>
-        <w:pStyle w:val="Heading1"/>
-      </w:pPr>
-      <w:r>
-        <w:t xml:space="preserve">Findings</w:t>
-      </w:r>
     </w:p>
     <w:p>
       <w:pPr>
-        <w:pStyle w:val="FirstParagraph"/>
-      </w:pPr>
-      <w:r>
-        <w:t xml:space="preserve">Four findings held, although every coefficient behind them was smaller than in the submitted manuscript. Stand density acted through the amount of host, with basal area entering at +0.430 log-odds per standard deviation in the submitted manuscript and at +0.290 in the revised final model, +0.183 with the terms for previous attack and +0.181 under the spatial field. Attack still peaked in stands of 25 to 30 cm quadratic mean diameter and fell in stands of larger trees. Shading was still not supported, since north-facing ground had more attack, +0.384 before and +0.112 now. Terrain shelter still acted alone rather than through stand density, with the wind shelter index entering at -0.267 before and at -0.066 now, and at -0.040 with the terms for previous attack, when its interaction with basal area was -0.021 (p = 0.110).</w:t>
+        <w:pStyle w:val="Compact"/>
+        <w:numPr>
+          <w:ilvl w:val="0"/>
+          <w:numId w:val="1001"/>
+        </w:numPr>
+      </w:pPr>
+      <w:r>
+        <w:t xml:space="preserve">A terrain wind model, WindNinja, was run from the reanalysis over the site at 90 m for every flight hour of ten summers, over the surrounding 60 by 80 km box at 500 m, over the whole Purcell Trench at 1 km with hourly values kept at four valley stations, and over the site at 30 m and the lidar terrain at 10 m once per period. It was checked against the stations hour by hour: at Creston the station recorded 9.1 km/h over the flight hours, the reanalysis cell over it 5.8 and the model 3.2, with direction errors of 61 and 59 degrees, so the direction is the reanalysis’s and the speed carries a constant step inside the model. The step was measured on flat ground at every mesh and removed, the direction limit is stated in the Methods, and the fields entered the models in place of the station wind, with a lift scale from the surface heat flux beside them (section 2.3).</w:t>
+      </w:r>
+      <w:r>
+        <w:t xml:space="preserve"> </w:t>
+      </w:r>
+      <w:r>
+        <w:t xml:space="preserve">The spatial statistics were added beside the submitted models. Join counts and a Moran’s I correlogram described the pattern of attack on each annual map before any model was fitted. The models were then built in the order of</w:t>
+      </w:r>
+      <w:r>
+        <w:t xml:space="preserve"> </w:t>
+      </w:r>
+      <w:r>
+        <w:t xml:space="preserve">Aukema et al. (2008)</w:t>
+      </w:r>
+      <w:r>
+        <w:t xml:space="preserve">, with the terms for attack in and around each cell the year before chosen first, and the final annual model was refitted with a latent spatial field and at grains of 90, 270 and 990 m (section 2.3).</w:t>
+      </w:r>
+    </w:p>
+    <w:bookmarkEnd w:id="22"/>
+    <w:bookmarkStart w:id="24" w:name="findings"/>
+    <w:p>
+      <w:pPr>
+        <w:pStyle w:val="Heading1"/>
+      </w:pPr>
+      <w:r>
+        <w:t xml:space="preserve">Findings</w:t>
       </w:r>
     </w:p>
     <w:p>
       <w:pPr>
-        <w:pStyle w:val="BodyText"/>
-      </w:pPr>
-      <w:r>
-        <w:t xml:space="preserve">Two findings changed. Flight-hour wind did not lower attack in thin stands, so plume disruption was not supported, as the reporting correction above explains. Read through its simple slopes, the interaction of live stems with wind in the first sixteen-day model, -0.012 (p = 0.034), meant that attack rose with wind in stands one standard deviation below the mean density, +0.026 (p = 0.001), but not in stands one standard deviation above it, +0.002 (p = 0.847), and once the previous period’s attack entered, wind raised attack at both densities. The interaction of wind with standing volume, -0.017 in the submitted manuscript, could no longer be distinguished from zero (p = 0.642). The effects of terrain shelter and openness also did not survive the checks added for spatial pattern. Under the latent spatial field, sky view, +0.285 in the submitted manuscript and +0.327 now, fell to -0.009 (p = 0.799), and the wind shelter index changed sign, to +0.082 (p &lt; 0.001). At coarser grain the shelter index lost significance at 90 m and sky view at 270 m. The submitted abstract concluded,</w:t>
-      </w:r>
-      <w:r>
-        <w:t xml:space="preserve"> </w:t>
-      </w:r>
-      <w:r>
-        <w:t xml:space="preserve">“Refugia are therefore proposed to lie on warm, windward ground in thin stands during windy flight periods.”</w:t>
-      </w:r>
-      <w:r>
-        <w:t xml:space="preserve"> </w:t>
-      </w:r>
-      <w:r>
-        <w:t xml:space="preserve">The revised manuscript concludes that refugia on this landscape were stands with little host, and that terrain and wind added small, scale-dependent modifiers to an outbreak whose spread was mostly contagion (abstract and section 4.7).</w:t>
+        <w:pStyle w:val="FirstParagraph"/>
+      </w:pPr>
+      <w:r>
+        <w:t xml:space="preserve">Four findings held, although every coefficient behind them was smaller than in the submitted manuscript. Stand density acted through the amount of host, with basal area entering at +0.430 log-odds per standard deviation in the submitted manuscript and at +0.290 in the revised final model, +0.183 with the terms for previous attack and +0.181 under the spatial field. Attack still peaked in stands of 25 to 30 cm quadratic mean diameter and fell in stands of larger trees. Shading was still not supported, since north-facing ground had more attack, +0.384 before and +0.112 now. Terrain shelter still acted alone rather than through stand density, with the wind shelter index entering at -0.267 before and at -0.066 now, and at -0.040 with the terms for previous attack, when its interaction with basal area was -0.021 (p = 0.110).</w:t>
       </w:r>
     </w:p>
     <w:p>
@@ -825,7 +790,19 @@
         <w:pStyle w:val="BodyText"/>
       </w:pPr>
       <w:r>
-        <w:t xml:space="preserve">The added spatial statistics produced the result the revised manuscript leads with. Attack was clustered in every year, with 3.2 to 5.3 times as many pairs of neighbouring attacked cells as random permutations produced, and with positive autocorrelation to a median of 2,610 m. Attack in each cell and within 150 m the year before dominated every model it entered, raising the area under the receiver operating characteristic curve of the final annual model from 0.805 to 0.879. Residual Moran’s I remained significant in every year, at a median of 0.337 even under the spatial field, so the p-values of every model were optimistic, and section 4.6 says so.</w:t>
+        <w:t xml:space="preserve">Two findings changed. Flight-hour wind did not lower attack in any stand structure the inventory described, so plume disruption was not supported. The station wind’s interaction with standing volume, -0.017 in the submitted manuscript, could no longer be distinguished from zero (p = 0.642), and with the terrain wind of the previous summer attack rose after a windier summer, +0.088 per standard deviation, most in stands of greater basal area and diameter, +0.049 and +0.048 (sections 3.2 and 3.3). The effects of terrain shelter and openness also did not survive the checks added for spatial pattern. Under the latent spatial field, sky view, +0.285 in the submitted manuscript and +0.327 now, fell to -0.009 (p = 0.799), and the wind shelter index changed sign, to +0.082 (p &lt; 0.001). At coarser grain the shelter index lost significance at 90 m and sky view at 270 m. The submitted abstract concluded,</w:t>
+      </w:r>
+      <w:r>
+        <w:t xml:space="preserve"> </w:t>
+      </w:r>
+      <w:r>
+        <w:t xml:space="preserve">“Refugia are therefore proposed to lie on warm, windward ground in thin stands during windy flight periods.”</w:t>
+      </w:r>
+      <w:r>
+        <w:t xml:space="preserve"> </w:t>
+      </w:r>
+      <w:r>
+        <w:t xml:space="preserve">The revised manuscript concludes that refugia on this landscape were stands with little host, and that terrain and wind added small, scale-dependent modifiers to an outbreak whose spread was mostly contagion (abstract and section 4.7).</w:t>
       </w:r>
     </w:p>
     <w:p>
@@ -833,12 +810,20 @@
         <w:pStyle w:val="BodyText"/>
       </w:pPr>
       <w:r>
+        <w:t xml:space="preserve">The added spatial statistics produced the result the revised manuscript leads with. Attack was clustered in every year, with 3.2 to 5.3 times as many pairs of neighbouring attacked cells as random permutations produced, and with positive autocorrelation to a median of 2,610 m. Attack in each cell and within 150 m the year before dominated every model it entered, raising the area under the receiver operating characteristic curve of the final annual model from 0.805 to 0.879. Residual Moran’s I remained significant in every year, at a median of 0.337 even under the spatial field, so the p-values of every model were optimistic, and section 4.6 says so.</w:t>
+      </w:r>
+    </w:p>
+    <w:p>
+      <w:pPr>
+        <w:pStyle w:val="BodyText"/>
+      </w:pPr>
+      <w:r>
         <w:t xml:space="preserve">Every number in the manuscript is computed by code in the manuscript file itself, and the file, the derived data and the analysis code are public at</w:t>
       </w:r>
       <w:r>
         <w:t xml:space="preserve"> </w:t>
       </w:r>
-      <w:hyperlink r:id="rId24">
+      <w:hyperlink r:id="rId23">
         <w:r>
           <w:rPr>
             <w:rStyle w:val="Hyperlink"/>
@@ -866,7 +851,7 @@
         <w:t xml:space="preserve">Dr Seamus Murphy</w:t>
       </w:r>
     </w:p>
-    <w:bookmarkEnd w:id="25"/>
+    <w:bookmarkEnd w:id="24"/>
     <w:sectPr>
       <w:footerReference r:id="rId10" w:type="default"/>
       <w:footerReference r:id="rId9" w:type="first"/>

</xml_diff>

<commit_message>
Rewrite the Results and Discussion by hypothesis and rebuild the submission package
The Results now answer the three questions of the Introduction in turn, naming
every variable that bears on each with its estimate and p-value, and the
Discussion mirrors them, setting each finding against the literature. The
model equations are written out in Methods 2.4.

Table 1 holds the response and the terms of M3 with a joint test of the
landform class, Table 2 is portrait with terms as rows and the landform
classes beneath the continuous terms, and Table 3 is gone. The flight-window
figure and the tool citations moved to the Supporting Information, which
gains Tables S11 to S13, Methods S2 and Results S1.

The author response, cover letter, tables file and new figures file match
the revised manuscript.
</commit_message>
<xml_diff>
--- a/01.manuscript/Author Response.docx
+++ b/01.manuscript/Author Response.docx
@@ -31,7 +31,7 @@
         <w:pStyle w:val="BodyText"/>
       </w:pPr>
       <w:r>
-        <w:t xml:space="preserve">Thank you for the decision of 22 September 2026 and for the invitation to resubmit. Each comment is quoted below as it appeared in the decision email, followed by what was done and where in the revised manuscript it can be found. Section numbers refer to the revised manuscript. The submitted manuscript also misread the sign of its main wind result, two defects in its data were repaired during the revision, and several findings changed as a result. The correction, the repairs, and which findings held and which changed, are set out after the responses so that nothing in the new manuscript arrives unannounced.</w:t>
+        <w:t xml:space="preserve">Thank you for the decision of 22 September 2026 and for the invitation to resubmit. Each comment is quoted below as it appeared in the decision email, followed by what was done and where in the revised manuscript it can be found. Section numbers refer to the revised manuscript. Two defects in the submitted data were repaired during the revision, the wind terms were rebuilt, and several findings changed as a result. The repairs, and which findings held and which changed, are set out after the responses so that nothing in the new manuscript arrives unannounced.</w:t>
       </w:r>
     </w:p>
     <w:bookmarkStart w:id="20" w:name="editor-in-chief"/>
@@ -76,16 +76,16 @@
         <w:t xml:space="preserve"> </w:t>
       </w:r>
       <w:r>
-        <w:t xml:space="preserve">The literature was gathered in two searches under written protocols, on 23 and 24 September 2026, which screened 1,257 and 4,430 unique records, and the reference list grew from 30 to 99 works. The Introduction (section 1) was rewritten on that literature. It opens with the beetle as a native disturbance agent of pine forests and the history of its outbreaks</w:t>
-      </w:r>
-      <w:r>
-        <w:t xml:space="preserve"> </w:t>
-      </w:r>
-      <w:r>
-        <w:t xml:space="preserve">(Jarvis &amp; Kulakowski, 2015; Taylor et al., 2006; Taylor &amp; Carroll, 2003)</w:t>
-      </w:r>
-      <w:r>
-        <w:t xml:space="preserve">, and then defines disturbance refugia and the three mechanisms proposed for them</w:t>
+        <w:t xml:space="preserve">The literature was gathered in two searches under written protocols, on 23 and 24 September 2026, which screened 1,257 and 4,430 unique records, and the reference list of the main text now holds 61 works against 30 in the submitted manuscript, with the sources of the wind and heat models moved to the Supporting Information. The Introduction (section 1) was rewritten on that literature, one study to a sentence. It opens with the beetle as a native disturbance agent of pine forests and the history of its outbreaks</w:t>
+      </w:r>
+      <w:r>
+        <w:t xml:space="preserve"> </w:t>
+      </w:r>
+      <w:r>
+        <w:t xml:space="preserve">(Macias Fauria &amp; Johnson, 2009; Raffa et al., 2008; Safranyik &amp; Carroll, 2006)</w:t>
+      </w:r>
+      <w:r>
+        <w:t xml:space="preserve">, defines disturbance refugia and the three mechanisms proposed for them</w:t>
       </w:r>
       <w:r>
         <w:t xml:space="preserve"> </w:t>
@@ -94,16 +94,7 @@
         <w:t xml:space="preserve">(Cartwright, 2018; Krawchuk et al., 2020)</w:t>
       </w:r>
       <w:r>
-        <w:t xml:space="preserve">. It sets out the biology each mechanism rests on, where pioneer beetles land</w:t>
-      </w:r>
-      <w:r>
-        <w:t xml:space="preserve"> </w:t>
-      </w:r>
-      <w:r>
-        <w:t xml:space="preserve">(Hynum &amp; Berryman, 1980)</w:t>
-      </w:r>
-      <w:r>
-        <w:t xml:space="preserve">, how a mass attack overcomes the defences of a tree and the threshold at which it does so</w:t>
+        <w:t xml:space="preserve">, and then sets out the biology each mechanism rests on, how a mass attack overcomes the defences of a tree and the threshold at which it does so</w:t>
       </w:r>
       <w:r>
         <w:t xml:space="preserve"> </w:t>
@@ -118,46 +109,55 @@
         <w:t xml:space="preserve"> </w:t>
       </w:r>
       <w:r>
-        <w:t xml:space="preserve">(Carroll &amp; Safranyik, 2004)</w:t>
-      </w:r>
-      <w:r>
-        <w:t xml:space="preserve">, how cold, the synchrony of flight and drought act on outbreaks</w:t>
-      </w:r>
-      <w:r>
-        <w:t xml:space="preserve"> </w:t>
-      </w:r>
-      <w:r>
-        <w:t xml:space="preserve">(Bleiker &amp; Van Hezewijk, 2016; Chapman et al., 2012; Preisler et al., 2012)</w:t>
-      </w:r>
-      <w:r>
-        <w:t xml:space="preserve">, and how beetles disperse within and between stands</w:t>
-      </w:r>
-      <w:r>
-        <w:t xml:space="preserve"> </w:t>
-      </w:r>
-      <w:r>
-        <w:t xml:space="preserve">(Aukema et al., 2008; Robertson et al., 2007; Safranyik et al., 1989; Safranyik et al., 1992)</w:t>
-      </w:r>
-      <w:r>
-        <w:t xml:space="preserve">. The thinning trials and stand measurements behind the density mechanism follow</w:t>
-      </w:r>
-      <w:r>
-        <w:t xml:space="preserve"> </w:t>
-      </w:r>
-      <w:r>
-        <w:t xml:space="preserve">(Anhold &amp; Jenkins, 1987; Bartos &amp; Amman, 1989; Mitchell et al., 1983; Preisler &amp; Mitchell, 1993)</w:t>
-      </w:r>
-      <w:r>
-        <w:t xml:space="preserve">, then the two ways wind could act, by breaking up the pheromone plume or by depositing beetles where it slows</w:t>
-      </w:r>
-      <w:r>
-        <w:t xml:space="preserve"> </w:t>
-      </w:r>
-      <w:r>
-        <w:t xml:space="preserve">(de la Giroday et al., 2011)</w:t>
-      </w:r>
-      <w:r>
-        <w:t xml:space="preserve">, and the three questions close the section. The Discussion was rewritten from the start, as described under comment 4.</w:t>
+        <w:t xml:space="preserve">(Carroll &amp; Safranyik, 2004; Safranyik et al., 2010)</w:t>
+      </w:r>
+      <w:r>
+        <w:t xml:space="preserve">, how beetles fly within a stand and how attack spreads from the year before</w:t>
+      </w:r>
+      <w:r>
+        <w:t xml:space="preserve"> </w:t>
+      </w:r>
+      <w:r>
+        <w:t xml:space="preserve">(Aukema et al., 2008; Kunegel-Lion &amp; Lewis, 2020; Robertson et al., 2007; Safranyik et al., 1989; Safranyik et al., 1992)</w:t>
+      </w:r>
+      <w:r>
+        <w:t xml:space="preserve">, how cold and drought act</w:t>
+      </w:r>
+      <w:r>
+        <w:t xml:space="preserve"> </w:t>
+      </w:r>
+      <w:r>
+        <w:t xml:space="preserve">(Chapman et al., 2012; Logan &amp; Powell, 2001; Preisler et al., 2012)</w:t>
+      </w:r>
+      <w:r>
+        <w:t xml:space="preserve">, how terrain entered earlier models</w:t>
+      </w:r>
+      <w:r>
+        <w:t xml:space="preserve"> </w:t>
+      </w:r>
+      <w:r>
+        <w:t xml:space="preserve">(Nelson et al., 2007; Walter &amp; Platt, 2013; Wulder et al., 2006)</w:t>
+      </w:r>
+      <w:r>
+        <w:t xml:space="preserve">, what thinning trials found and why</w:t>
+      </w:r>
+      <w:r>
+        <w:t xml:space="preserve"> </w:t>
+      </w:r>
+      <w:r>
+        <w:t xml:space="preserve">(Amman et al., 1988; Bartos &amp; Amman, 1989; Fettig et al., 2007; Mitchell et al., 1983; Shore et al., 2006)</w:t>
+      </w:r>
+      <w:r>
+        <w:t xml:space="preserve">, and the two ways wind can act</w:t>
+      </w:r>
+      <w:r>
+        <w:t xml:space="preserve"> </w:t>
+      </w:r>
+      <w:r>
+        <w:t xml:space="preserve">(Ainslie &amp; Jackson, 2010; de la Giroday et al., 2011; Hynum &amp; Berryman, 1980; Jackson et al., 2008)</w:t>
+      </w:r>
+      <w:r>
+        <w:t xml:space="preserve">. The Discussion (section 4) sets each finding against that literature, as described under comments 4 and 5.</w:t>
       </w:r>
     </w:p>
     <w:p>
@@ -193,43 +193,19 @@
         <w:t xml:space="preserve"> </w:t>
       </w:r>
       <w:r>
-        <w:t xml:space="preserve">The novelty is stated as what the study did rather than as a claim about what no one else has done. The first statement of the abstract names the gap, how little is known about how the three mechanisms act together once attack nearby and earlier is taken into account. The Introduction (section 1) then sets out how earlier models entered each part of the design. Terrain entered landscape models of the outbreak as elevation, slope and aspect</w:t>
-      </w:r>
-      <w:r>
-        <w:t xml:space="preserve"> </w:t>
-      </w:r>
-      <w:r>
-        <w:t xml:space="preserve">(Walter &amp; Platt, 2013; Wulder et al., 2006)</w:t>
-      </w:r>
-      <w:r>
-        <w:t xml:space="preserve">, a machine-learning model described wind by a mean of daily station wind for July and August</w:t>
-      </w:r>
-      <w:r>
-        <w:t xml:space="preserve"> </w:t>
-      </w:r>
-      <w:r>
-        <w:t xml:space="preserve">(Ramazi et al., 2021)</w:t>
-      </w:r>
-      <w:r>
-        <w:t xml:space="preserve">, and models of flight above the canopy resolved wind over terrain but not within the stand</w:t>
-      </w:r>
-      <w:r>
-        <w:t xml:space="preserve"> </w:t>
-      </w:r>
-      <w:r>
-        <w:t xml:space="preserve">(Ainslie &amp; Jackson, 2010; Jackson et al., 2008)</w:t>
-      </w:r>
-      <w:r>
-        <w:t xml:space="preserve">. Against that, this study tested the three mechanisms together on one landscape, with attack nearby and in the previous year in every model, and it tested the two ways wind could act, plume disruption with a terrain-adjusted wind field over the afternoon flight hours of each sixteen-day period, and deposition with a wind shelter index computed from the terrain (sections 1 and 2.3). It also split the terrain ruggedness of the companion study</w:t>
-      </w:r>
-      <w:r>
-        <w:t xml:space="preserve"> </w:t>
-      </w:r>
-      <w:r>
-        <w:t xml:space="preserve">(Murphy et al., 2026)</w:t>
-      </w:r>
-      <w:r>
-        <w:t xml:space="preserve">, which had the largest coefficient of any variable on seedling density there, into the properties of the ground that the biology of the beetle concerns, and kept ruggedness as a candidate so that the split was tested rather than assumed (section 2.1).</w:t>
+        <w:t xml:space="preserve">The novelty is stated in three places, as what the study did. The first statement of the abstract names the gap, how little is known about how the three mechanisms act together once attack nearby and earlier is taken into account. The last paragraph of the Introduction states that few studies had tested these mechanisms together while accounting for attack nearby, and sets the three questions. The opening paragraph of the Discussion states that the novelty of the study lay in testing the three mechanisms of</w:t>
+      </w:r>
+      <w:r>
+        <w:t xml:space="preserve"> </w:t>
+      </w:r>
+      <w:r>
+        <w:t xml:space="preserve">Krawchuk et al. (2020)</w:t>
+      </w:r>
+      <w:r>
+        <w:t xml:space="preserve"> </w:t>
+      </w:r>
+      <w:r>
+        <w:t xml:space="preserve">together on one landscape at 30 m with attack in and around each cell the year before in every model, and in testing the two ways wind could act, breaking up the pheromone plume and depositing beetles on sheltered ground, with a terrain wind model over the afternoon flight hours of each sixteen-day period.</w:t>
       </w:r>
     </w:p>
     <w:bookmarkEnd w:id="20"/>
@@ -371,7 +347,7 @@
         <w:t xml:space="preserve">Kunegel-Lion &amp; Lewis (2020)</w:t>
       </w:r>
       <w:r>
-        <w:t xml:space="preserve">.</w:t>
+        <w:t xml:space="preserve">. The Discussion rests on the same literature, section by section.</w:t>
       </w:r>
     </w:p>
     <w:p>
@@ -407,7 +383,7 @@
         <w:t xml:space="preserve"> </w:t>
       </w:r>
       <w:r>
-        <w:t xml:space="preserve">The Discussion (section 4) was rewritten in seven sections, each of which sets a result against prior work on the beetle, and coefficients are repeated only where the argument needs them. Section 4.1 reads the dominance of attack nearby and the year before against</w:t>
+        <w:t xml:space="preserve">The Discussion (section 4) was rewritten in four sections that mirror the three questions of the Results, and coefficients are repeated only where an argument needs them. Its opening paragraph reads the dominance of attack nearby and the year before against</w:t>
       </w:r>
       <w:r>
         <w:t xml:space="preserve"> </w:t>
@@ -428,15 +404,6 @@
         <w:t xml:space="preserve">(Walter &amp; Platt, 2013)</w:t>
       </w:r>
       <w:r>
-        <w:t xml:space="preserve">, dispersal under the canopy</w:t>
-      </w:r>
-      <w:r>
-        <w:t xml:space="preserve"> </w:t>
-      </w:r>
-      <w:r>
-        <w:t xml:space="preserve">(Safranyik et al., 2010)</w:t>
-      </w:r>
-      <w:r>
         <w:t xml:space="preserve"> </w:t>
       </w:r>
       <w:r>
@@ -449,16 +416,16 @@
         <w:t xml:space="preserve">(Meddens &amp; Hicke, 2014)</w:t>
       </w:r>
       <w:r>
-        <w:t xml:space="preserve">. Section 4.2 reads the host result against the stand susceptibility rating used in British Columbia</w:t>
-      </w:r>
-      <w:r>
-        <w:t xml:space="preserve"> </w:t>
-      </w:r>
-      <w:r>
-        <w:t xml:space="preserve">(Shore et al., 2000)</w:t>
-      </w:r>
-      <w:r>
-        <w:t xml:space="preserve">, the thinning trials, the history of the province’s pine</w:t>
+        <w:t xml:space="preserve">. Section 4.1 reads the density result against the stand susceptibility rating used in British Columbia</w:t>
+      </w:r>
+      <w:r>
+        <w:t xml:space="preserve"> </w:t>
+      </w:r>
+      <w:r>
+        <w:t xml:space="preserve">(Safranyik et al., 2010; Shore et al., 2000)</w:t>
+      </w:r>
+      <w:r>
+        <w:t xml:space="preserve">, the thinning trials and the history of the province’s pine</w:t>
       </w:r>
       <w:r>
         <w:t xml:space="preserve"> </w:t>
@@ -467,7 +434,28 @@
         <w:t xml:space="preserve">(Taylor &amp; Carroll, 2003)</w:t>
       </w:r>
       <w:r>
-        <w:t xml:space="preserve">, the dependence of brood production on phloem thickness</w:t>
+        <w:t xml:space="preserve">, reads the shade result against the observation that the heaviest attacks on a bole are found on its northern side</w:t>
+      </w:r>
+      <w:r>
+        <w:t xml:space="preserve"> </w:t>
+      </w:r>
+      <w:r>
+        <w:t xml:space="preserve">(Safranyik &amp; Carroll, 2006)</w:t>
+      </w:r>
+      <w:r>
+        <w:t xml:space="preserve"> </w:t>
+      </w:r>
+      <w:r>
+        <w:t xml:space="preserve">and that attacks fall at midday with the highest temperatures</w:t>
+      </w:r>
+      <w:r>
+        <w:t xml:space="preserve"> </w:t>
+      </w:r>
+      <w:r>
+        <w:t xml:space="preserve">(Schmid et al., 1991)</w:t>
+      </w:r>
+      <w:r>
+        <w:t xml:space="preserve">, and reads host size against the dependence of brood production on phloem thickness</w:t>
       </w:r>
       <w:r>
         <w:t xml:space="preserve"> </w:t>
@@ -476,10 +464,7 @@
         <w:t xml:space="preserve">(Amman, 1972)</w:t>
       </w:r>
       <w:r>
-        <w:t xml:space="preserve"> </w:t>
-      </w:r>
-      <w:r>
-        <w:t xml:space="preserve">and the 25 cm boundary between beetle sinks and sources</w:t>
+        <w:t xml:space="preserve">, the 25 cm boundary between beetle sinks and sources</w:t>
       </w:r>
       <w:r>
         <w:t xml:space="preserve"> </w:t>
@@ -488,67 +473,52 @@
         <w:t xml:space="preserve">(Carroll &amp; Safranyik, 2004)</w:t>
       </w:r>
       <w:r>
-        <w:t xml:space="preserve">. Section 4.3 sets out three explanations for more attack on higher ground, where the pine grew</w:t>
-      </w:r>
-      <w:r>
-        <w:t xml:space="preserve"> </w:t>
-      </w:r>
-      <w:r>
-        <w:t xml:space="preserve">(Wulder et al., 2006)</w:t>
-      </w:r>
-      <w:r>
-        <w:t xml:space="preserve">, the phase of the outbreak</w:t>
-      </w:r>
-      <w:r>
-        <w:t xml:space="preserve"> </w:t>
-      </w:r>
-      <w:r>
-        <w:t xml:space="preserve">(Walter &amp; Platt, 2013)</w:t>
-      </w:r>
-      <w:r>
-        <w:t xml:space="preserve"> </w:t>
-      </w:r>
-      <w:r>
-        <w:t xml:space="preserve">and a milder climate</w:t>
-      </w:r>
-      <w:r>
-        <w:t xml:space="preserve"> </w:t>
-      </w:r>
-      <w:r>
-        <w:t xml:space="preserve">(Macias Fauria &amp; Johnson, 2009)</w:t>
-      </w:r>
-      <w:r>
-        <w:t xml:space="preserve">. Section 4.4 reads the aspect result against the reverse pattern found elsewhere</w:t>
-      </w:r>
-      <w:r>
-        <w:t xml:space="preserve"> </w:t>
-      </w:r>
-      <w:r>
-        <w:t xml:space="preserve">(Kaiser et al., 2012; Nelson et al., 2007; Walter &amp; Platt, 2013)</w:t>
-      </w:r>
-      <w:r>
-        <w:t xml:space="preserve"> </w:t>
-      </w:r>
-      <w:r>
-        <w:t xml:space="preserve">and the rise in flight with light intensity</w:t>
-      </w:r>
-      <w:r>
-        <w:t xml:space="preserve"> </w:t>
-      </w:r>
-      <w:r>
-        <w:t xml:space="preserve">(Safranyik &amp; Carroll, 2006)</w:t>
-      </w:r>
-      <w:r>
-        <w:t xml:space="preserve">. Section 4.5 explains why plume disruption could not be shown, from the stand measurements it rests on</w:t>
-      </w:r>
-      <w:r>
-        <w:t xml:space="preserve"> </w:t>
-      </w:r>
-      <w:r>
-        <w:t xml:space="preserve">(Bartos &amp; Amman, 1989; Thistle et al., 2004)</w:t>
-      </w:r>
-      <w:r>
-        <w:t xml:space="preserve">, the finding that pheromones from adjacent unmanaged stands may override the benefit of spacing</w:t>
+        <w:t xml:space="preserve"> </w:t>
+      </w:r>
+      <w:r>
+        <w:t xml:space="preserve">and the depletion of large pine by epidemics</w:t>
+      </w:r>
+      <w:r>
+        <w:t xml:space="preserve"> </w:t>
+      </w:r>
+      <w:r>
+        <w:t xml:space="preserve">(Shore et al., 2006)</w:t>
+      </w:r>
+      <w:r>
+        <w:t xml:space="preserve">. Section 4.2 reads the wind result against the stand measurements of</w:t>
+      </w:r>
+      <w:r>
+        <w:t xml:space="preserve"> </w:t>
+      </w:r>
+      <w:r>
+        <w:t xml:space="preserve">Bartos &amp; Amman (1989)</w:t>
+      </w:r>
+      <w:r>
+        <w:t xml:space="preserve"> </w:t>
+      </w:r>
+      <w:r>
+        <w:t xml:space="preserve">and</w:t>
+      </w:r>
+      <w:r>
+        <w:t xml:space="preserve"> </w:t>
+      </w:r>
+      <w:r>
+        <w:t xml:space="preserve">Thistle et al. (2004)</w:t>
+      </w:r>
+      <w:r>
+        <w:t xml:space="preserve">, wind above the canopy carrying beetles into new stands</w:t>
+      </w:r>
+      <w:r>
+        <w:t xml:space="preserve"> </w:t>
+      </w:r>
+      <w:r>
+        <w:t xml:space="preserve">(Chen &amp; Jackson, 2017; Jackson et al., 2008)</w:t>
+      </w:r>
+      <w:r>
+        <w:t xml:space="preserve"> </w:t>
+      </w:r>
+      <w:r>
+        <w:t xml:space="preserve">and pheromones from adjacent stands overriding the benefit of spacing</w:t>
       </w:r>
       <w:r>
         <w:t xml:space="preserve"> </w:t>
@@ -557,28 +527,61 @@
         <w:t xml:space="preserve">(Schmid &amp; Mata, 2005)</w:t>
       </w:r>
       <w:r>
-        <w:t xml:space="preserve">, and wind above the canopy carrying beetles into new stands</w:t>
-      </w:r>
-      <w:r>
-        <w:t xml:space="preserve"> </w:t>
-      </w:r>
-      <w:r>
-        <w:t xml:space="preserve">(Chen &amp; Jackson, 2017; Jackson et al., 2008)</w:t>
-      </w:r>
-      <w:r>
-        <w:t xml:space="preserve">. Section 4.6 reads the terrain result as deposition</w:t>
-      </w:r>
-      <w:r>
-        <w:t xml:space="preserve"> </w:t>
-      </w:r>
-      <w:r>
-        <w:t xml:space="preserve">(Byers, 2000; de la Giroday et al., 2011)</w:t>
-      </w:r>
-      <w:r>
-        <w:t xml:space="preserve"> </w:t>
-      </w:r>
-      <w:r>
-        <w:t xml:space="preserve">and takes up the scale of inference</w:t>
+        <w:t xml:space="preserve">. Section 4.3 reads the shelter result against the windward attack</w:t>
+      </w:r>
+      <w:r>
+        <w:t xml:space="preserve"> </w:t>
+      </w:r>
+      <w:r>
+        <w:t xml:space="preserve">de la Giroday et al. (2011)</w:t>
+      </w:r>
+      <w:r>
+        <w:t xml:space="preserve"> </w:t>
+      </w:r>
+      <w:r>
+        <w:t xml:space="preserve">found in the Peace River region, the crosswind and downwind flight that</w:t>
+      </w:r>
+      <w:r>
+        <w:t xml:space="preserve"> </w:t>
+      </w:r>
+      <w:r>
+        <w:t xml:space="preserve">Safranyik et al. (1989)</w:t>
+      </w:r>
+      <w:r>
+        <w:t xml:space="preserve"> </w:t>
+      </w:r>
+      <w:r>
+        <w:t xml:space="preserve">recorded, the flight limit of</w:t>
+      </w:r>
+      <w:r>
+        <w:t xml:space="preserve"> </w:t>
+      </w:r>
+      <w:r>
+        <w:t xml:space="preserve">Carroll &amp; Safranyik (2004)</w:t>
+      </w:r>
+      <w:r>
+        <w:t xml:space="preserve">, the north-facing onset in the Cypress Hills</w:t>
+      </w:r>
+      <w:r>
+        <w:t xml:space="preserve"> </w:t>
+      </w:r>
+      <w:r>
+        <w:t xml:space="preserve">(Kunegel-Lion &amp; Lewis, 2020)</w:t>
+      </w:r>
+      <w:r>
+        <w:t xml:space="preserve">, deposition within the stand</w:t>
+      </w:r>
+      <w:r>
+        <w:t xml:space="preserve"> </w:t>
+      </w:r>
+      <w:r>
+        <w:t xml:space="preserve">(Byers, 2000)</w:t>
+      </w:r>
+      <w:r>
+        <w:t xml:space="preserve"> </w:t>
+      </w:r>
+      <w:r>
+        <w:t xml:space="preserve">and the scale of inference that</w:t>
       </w:r>
       <w:r>
         <w:t xml:space="preserve"> </w:t>
@@ -590,7 +593,7 @@
         <w:t xml:space="preserve"> </w:t>
       </w:r>
       <w:r>
-        <w:t xml:space="preserve">raised, and section 4.7 sets out the limits of the study and what it means for management.</w:t>
+        <w:t xml:space="preserve">raised. Section 4.4 sets out the limits of the study and what the findings mean for management.</w:t>
       </w:r>
     </w:p>
     <w:p>
@@ -626,25 +629,7 @@
         <w:t xml:space="preserve"> </w:t>
       </w:r>
       <w:r>
-        <w:t xml:space="preserve">Each section of the Discussion reads a result through the beetle rather than through the model. The biology appears in sections 4.1, 4.2, 4.4 and 4.5, through dispersal under the canopy, the dependence of brood production on phloem thickness, the rise in flight with light intensity and the fading of attacked crowns in the summer after attack</w:t>
-      </w:r>
-      <w:r>
-        <w:t xml:space="preserve"> </w:t>
-      </w:r>
-      <w:r>
-        <w:t xml:space="preserve">(Safranyik &amp; Carroll, 2006)</w:t>
-      </w:r>
-      <w:r>
-        <w:t xml:space="preserve">. The ecology appears in sections 4.2, 4.3 and 4.6, through the age structure of the province’s pine, the climate of high ground and the change in what predicts attack as an outbreak progresses</w:t>
-      </w:r>
-      <w:r>
-        <w:t xml:space="preserve"> </w:t>
-      </w:r>
-      <w:r>
-        <w:t xml:space="preserve">(Walter &amp; Platt, 2013)</w:t>
-      </w:r>
-      <w:r>
-        <w:t xml:space="preserve">. Management appears in section 4.7, which states that the refugia this landscape showed were stands with little host, the structure that thinning and a younger age structure produce, and that terrain maps alone could not locate them. It sets that finding against the rating under which partial cutting lowers the susceptibility of a stand</w:t>
+        <w:t xml:space="preserve">Each section of the Discussion reads a result through the beetle rather than through the model. The biology appears in sections 4.1 and 4.3, through the brood that thicker phloem feeds, the side of the bole that is attacked, the fall in attack at midday heat, flight crosswind and downwind of an attacked tree and the wind speed above which the beetle cannot fly. The ecology appears in sections 4.1 and 4.3, through the age structure of the province’s pine, the pine that grew on the higher ground of this range, the phase of the outbreak and the difference between a refugium defined at 30 m and one defined at 1 km. Management appears in sections 4.2 and 4.4. Section 4.2 states that a stand opened by thinning was protected by the wind only during flight and least where attacked trees stood close, and section 4.4 states that the refugia this landscape showed were stands with little host, the structure that thinning and a younger age structure produce, which terrain maps alone could not locate, and sets that against the rating under which partial cutting lowers the susceptibility of a stand</w:t>
       </w:r>
       <w:r>
         <w:t xml:space="preserve"> </w:t>
@@ -674,7 +659,7 @@
         <w:t xml:space="preserve"> </w:t>
       </w:r>
       <w:r>
-        <w:t xml:space="preserve">that the field evidence for thinning during an outbreak was weaker than policy had assumed. It closes with the finding that flight-period wind did not strengthen that protection.</w:t>
+        <w:t xml:space="preserve">that the field evidence for thinning during an outbreak was weaker than policy had assumed.</w:t>
       </w:r>
     </w:p>
     <w:bookmarkEnd w:id="21"/>
@@ -692,7 +677,7 @@
         <w:pStyle w:val="FirstParagraph"/>
       </w:pPr>
       <w:r>
-        <w:t xml:space="preserve">Two defects in the submitted data were repaired, and the spatial statistics of</w:t>
+        <w:t xml:space="preserve">Two defects in the submitted data were repaired, the wind terms were rebuilt, and the spatial statistics of</w:t>
       </w:r>
       <w:r>
         <w:t xml:space="preserve"> </w:t>
@@ -716,7 +701,7 @@
         </w:numPr>
       </w:pPr>
       <w:r>
-        <w:t xml:space="preserve">The attack maps were rebuilt with a new classifier, trained on the 112 Landsat pixels of the field plots, four to a plot, against undisturbed forest digitised for the companion study, and tested over 100 random splits that each held out a quarter of the plots and of the 100 m blocks of undisturbed pixels. The radial support vector machine reached kappa 0.859 ± 0.081, and its cut was applied to the annual maps and to the 47 sixteen-day maps alike (section 2.2, Table 2). The table of attack by diameter class was rebuilt on the repaired maps (Table 6). The annual maps in the submitted manuscript came from an earlier classifier trained on 38 plots, with a leave-one-out kappa of 0.475, while its Methods described the classification of</w:t>
+        <w:t xml:space="preserve">The attack maps were rebuilt with a new classifier, trained on the 112 Landsat pixels of the field plots, four to a plot, against undisturbed forest digitised for the companion study, and tested over 100 random splits that each held out a quarter of the plots and of the 100 m blocks of undisturbed pixels. The radial support vector machine reached kappa 0.859 ± 0.081, and its cut was applied to the annual maps and to the 47 sixteen-day maps alike (section 2.2, Table S6). The table of attack by diameter class was rebuilt on the repaired maps (Table S8). The annual maps in the submitted manuscript came from an earlier classifier trained on 38 plots, with a leave-one-out kappa of 0.475, while its Methods described the classification of</w:t>
       </w:r>
       <w:r>
         <w:t xml:space="preserve"> </w:t>
@@ -725,7 +710,7 @@
         <w:t xml:space="preserve">Murphy et al. (2026)</w:t>
       </w:r>
       <w:r>
-        <w:t xml:space="preserve">.</w:t>
+        <w:t xml:space="preserve">. The summer of 2012, which the submitted manuscript left out, was mapped from Landsat 7 alone and entered the annual models (section 2.2).</w:t>
       </w:r>
     </w:p>
     <w:p>
@@ -737,7 +722,7 @@
         </w:numPr>
       </w:pPr>
       <w:r>
-        <w:t xml:space="preserve">The terrain-adjusted wind field was recomputed on an elevation model extending beyond the study area. In the submitted analysis its curvature term was computed on an elevation model cut to the study area, so the field covered 18,388 of the 61,923 cells, and every wind term rested on that partial field. It now covers all of them (section 2.2).</w:t>
+        <w:t xml:space="preserve">The terrain-adjusted station wind was recomputed on an elevation model extending beyond the study area. In the submitted analysis its curvature term was computed on an elevation model cut to the study area, so the field covered 18,388 of the 61,923 cells, every wind term rested on that partial field, and the models were fitted on the cells it covered. It now covers all of them (section 2.2).</w:t>
       </w:r>
     </w:p>
     <w:p>
@@ -749,11 +734,13 @@
         </w:numPr>
       </w:pPr>
       <w:r>
-        <w:t xml:space="preserve">A terrain wind model, WindNinja, was run from the reanalysis over the site at 90 m for every flight hour of ten summers, over the surrounding 60 by 80 km box at 500 m, over the whole Purcell Trench at 1 km with hourly values kept at four valley stations, and over the site at 30 m and the lidar terrain at 10 m once per period. It was checked against the stations hour by hour: at Creston the station recorded 9.1 km/h over the flight hours, the reanalysis cell over it 5.8 and the model 3.2, with direction errors of 61 and 59 degrees, so the direction is the reanalysis’s and the speed carries a constant step inside the model. The step was measured on flat ground at every mesh and removed, the direction limit is stated in the Methods, and the fields entered the models in place of the station wind, with a lift scale from the surface heat flux beside them (section 2.3).</w:t>
-      </w:r>
-      <w:r>
-        <w:t xml:space="preserve"> </w:t>
-      </w:r>
+        <w:t xml:space="preserve">A terrain wind model, WindNinja, was run from the reanalysis over the site at 90 m for every flight hour of ten summers, over the surrounding 60 by 80 km box at 500 m, over the whole Purcell Trench at 1 km with hourly values kept at four valley stations, and over the site at 30 m and the lidar terrain at 10 m once per flight window. It was checked against the stations hour by hour. At Creston the station recorded 9.1 km/h over the flight hours, the reanalysis cell over it 5.8 and the model 3.2, with direction errors of 61 and 59 degrees, so the direction is the reanalysis’s and the speed carries a constant step inside the model. The step was measured on flat ground at every mesh and removed, the direction limit is stated in the Methods (section 2.3, Table S10), and the fields entered the models beside the station wind, with the wind of the same period of the previous summer as well as the same period’s, because the red crowns of a period record the flight of the summer before.</w:t>
+      </w:r>
+    </w:p>
+    <w:p>
+      <w:pPr>
+        <w:pStyle w:val="FirstParagraph"/>
+      </w:pPr>
       <w:r>
         <w:t xml:space="preserve">The spatial statistics were added beside the submitted models. Join counts and a Moran’s I correlogram described the pattern of attack on each annual map before any model was fitted. The models were then built in the order of</w:t>
       </w:r>
@@ -764,7 +751,7 @@
         <w:t xml:space="preserve">Aukema et al. (2008)</w:t>
       </w:r>
       <w:r>
-        <w:t xml:space="preserve">, with the terms for attack in and around each cell the year before chosen first, and the final annual model was refitted with a latent spatial field and at grains of 90, 270 and 990 m (section 2.3).</w:t>
+        <w:t xml:space="preserve">, with the terms for attack in and around each cell the year before chosen first, and the final annual model was refitted with a latent spatial field and at grains of 90, 270 and 990 m (section 2.4, equations 1 to 3). Every candidate variable was screened beside the dependence terms by likelihood ratio test, variance inflation and an elastic net (Table 1), and the sixteen-day models and every further specification are reported in full in the Supporting Information (Tables S4, S11 and S12).</w:t>
       </w:r>
     </w:p>
     <w:bookmarkEnd w:id="22"/>
@@ -782,7 +769,7 @@
         <w:pStyle w:val="FirstParagraph"/>
       </w:pPr>
       <w:r>
-        <w:t xml:space="preserve">Four findings held, although every coefficient behind them was smaller than in the submitted manuscript. Stand density acted through the amount of host, with basal area entering at +0.430 log-odds per standard deviation in the submitted manuscript and at +0.290 in the revised final model, +0.183 with the terms for previous attack and +0.181 under the spatial field. Attack still peaked in stands of 25 to 30 cm quadratic mean diameter and fell in stands of larger trees. Shading was still not supported, since north-facing ground had more attack, +0.384 before and +0.112 now. Terrain shelter still acted alone rather than through stand density, with the wind shelter index entering at -0.267 before and at -0.066 now, and at -0.040 with the terms for previous attack, when its interaction with basal area was -0.021 (p = 0.110).</w:t>
+        <w:t xml:space="preserve">The Results (section 3) now answer the three questions in turn, each section naming the variables that bear on the question with their estimates, and the Discussion follows the same order. Three findings held. Stand density acted through the amount of host, with basal area entering at +0.430 log-odds per standard deviation in the submitted manuscript and at +0.276 in the revised final model, +0.167 with the terms for previous attack and +0.200 under the spatial field, so the thinnest stands had the least attack. Attack still peaked in stands of 25 to 30 cm quadratic mean diameter and fell in stands of larger trees, which held little pine. Ground facing the afternoon wind still had the least attack, with the wind shelter index entering at -0.267 before and at -0.073 now, -0.032 with the terms for previous attack (p = 0.043), and with no interaction with basal area (p = 0.971), as deposition predicts; the shelter index at each cell’s own modelled wind direction, the share of flight hours blowing upslope and the slope updraft all pointed the same way (section 3.3).</w:t>
       </w:r>
     </w:p>
     <w:p>
@@ -790,7 +777,7 @@
         <w:pStyle w:val="BodyText"/>
       </w:pPr>
       <w:r>
-        <w:t xml:space="preserve">Two findings changed. Flight-hour wind did not lower attack in any stand structure the inventory described, so plume disruption was not supported. The station wind’s interaction with standing volume, -0.017 in the submitted manuscript, could no longer be distinguished from zero (p = 0.642), and with the terrain wind of the previous summer attack rose after a windier summer, +0.088 per standard deviation, most in stands of greater basal area and diameter, +0.049 and +0.048 (sections 3.2 and 3.3). The effects of terrain shelter and openness also did not survive the checks added for spatial pattern. Under the latent spatial field, sky view, +0.285 in the submitted manuscript and +0.327 now, fell to -0.009 (p = 0.799), and the wind shelter index changed sign, to +0.082 (p &lt; 0.001). At coarser grain the shelter index lost significance at 90 m and sky view at 270 m. The submitted abstract concluded,</w:t>
+        <w:t xml:space="preserve">Three findings changed. First, the submitted manuscript read shading as unsupported because north-facing ground had more attack, +0.384 before and +0.073 now. The revised manuscript reads the shade mechanism through the terms that measure shade by terrain, sky view, +0.285 before and +0.170 now with the terms for previous attack, and the direct sun of the flight window, +0.085, so terrain-shaded ground had less attack as the hypothesis predicted while north faces remained the exception, and it states that the effect did not survive the spatial field, under which sky view fell to +0.037 (p = 0.285). Second, the submitted manuscript tested plume disruption with the station wind and standing volume, an interaction of -0.017, which could no longer be distinguished from zero once the previous period’s attack entered (p = 0.296). With the terrain wind of the previous summer and crown closure as the measure of openness, the interaction was +0.071 (p &lt; 0.001), so that the wind effect was -0.085 in stands one standard deviation below the mean crown closure and +0.056 one above it. Wind lowered attack where the canopy was open and raised it where it was closed, which supports plume disruption in the sixteen-day models, while in the annual models the station wind raised attack at every density, +0.224 (section 3.2). Third, the shelter effect, although it held in sign, was small and changed sign under the latent spatial field, to +0.096 (p &lt; 0.001), and lost significance at a 90 m grain, so the revised manuscript reports it as weak and dependent on grain and place. The submitted abstract concluded,</w:t>
       </w:r>
       <w:r>
         <w:t xml:space="preserve"> </w:t>
@@ -802,7 +789,7 @@
         <w:t xml:space="preserve"> </w:t>
       </w:r>
       <w:r>
-        <w:t xml:space="preserve">The revised manuscript concludes that refugia on this landscape were stands with little host, and that terrain and wind added small, scale-dependent modifiers to an outbreak whose spread was mostly contagion (abstract and section 4.7).</w:t>
+        <w:t xml:space="preserve">The revised abstract concludes that refugia on this landscape were stands with little host, and that terrain and wind added small, scale-dependent modifiers to an outbreak whose spread was mostly contagion.</w:t>
       </w:r>
     </w:p>
     <w:p>
@@ -810,7 +797,7 @@
         <w:pStyle w:val="BodyText"/>
       </w:pPr>
       <w:r>
-        <w:t xml:space="preserve">The added spatial statistics produced the result the revised manuscript leads with. Attack was clustered in every year, with 3.2 to 5.3 times as many pairs of neighbouring attacked cells as random permutations produced, and with positive autocorrelation to a median of 2,610 m. Attack in each cell and within 150 m the year before dominated every model it entered, raising the area under the receiver operating characteristic curve of the final annual model from 0.805 to 0.879. Residual Moran’s I remained significant in every year, at a median of 0.337 even under the spatial field, so the p-values of every model were optimistic, and section 4.6 says so.</w:t>
+        <w:t xml:space="preserve">The added spatial statistics produced the result the revised manuscript leads with. Attack was clustered in every year, with 3.2 to 5.8 times as many pairs of neighbouring attacked cells as random permutations produced, and with positive autocorrelation to a median of 2,640 m. Attack in each cell and within 150 m the year before dominated every model it entered, raising the area under the receiver operating characteristic curve of the final annual model from 0.814 to 0.890. Residual Moran’s I remained significant in every year, at a median of 0.345 even under the spatial field, so the p-values of every model were optimistic, and section 4.3 says so.</w:t>
       </w:r>
     </w:p>
     <w:p>

</xml_diff>